<commit_message>
Publish provincial base documents for all 32 provinces
</commit_message>
<xml_diff>
--- a/public/downloads/planes-provinciales/03140000_Plan_Provincial_Maria_Trinidad_Sanchez_Documento_Base_2026.docx
+++ b/public/downloads/planes-provinciales/03140000_Plan_Provincial_Maria_Trinidad_Sanchez_Documento_Base_2026.docx
@@ -560,7 +560,7 @@
           <w:color w:val="203740"/>
           <w:sz w:val="21"/>
         </w:rPr>
-        <w:t>María Trinidad Sánchez registró 156,633 habitantes en el Censo 2022, distribuidos entre Nagua, Cabrera, El Factor y Río San Juan. Este documento organiza información factual sobre población, servicios, condiciones sociales, seguridad, educación, economía, salud, deporte, inversión pública, permisos y demandas provinciales.</w:t>
+        <w:t>María Trinidad Sánchez registró 156,633 habitantes en el Censo 2022, distribuidos en 4 municipios: Cabrera, El Factor, Nagua y Río San Juan. Este documento organiza información factual sobre población, servicios, condiciones sociales, seguridad, educación, economía, salud, deporte, inversión pública, permisos y demandas provinciales.</w:t>
       </w:r>
     </w:p>
     <w:p>
@@ -623,7 +623,7 @@
                 <w:color w:val="203740"/>
                 <w:sz w:val="19"/>
               </w:rPr>
-              <w:t>Los datos y las diez demandas consolidadas están preelaborados como insumos. Ninguna visión, objetivo, acción, proyecto, meta, presupuesto, responsable o plazo ha sido decidido en este documento.</w:t>
+              <w:t>Los datos y los registros de demandas (10 en el consolidado consultado) están preelaborados como insumos. Ninguna visión, objetivo, acción, proyecto, meta, presupuesto, responsable o plazo ha sido decidido en este documento.</w:t>
             </w:r>
           </w:p>
         </w:tc>
@@ -1629,7 +1629,7 @@
                 <w:color w:val="203740"/>
                 <w:sz w:val="17"/>
               </w:rPr>
-              <w:t>Nagua, Cabrera, El Factor y Río San Juan</w:t>
+              <w:t>Cabrera, El Factor, Nagua y Río San Juan</w:t>
             </w:r>
           </w:p>
         </w:tc>
@@ -4188,316 +4188,608 @@
     </w:p>
     <w:p>
       <w:pPr>
-        <w:pStyle w:val="Heading2"/>
-      </w:pPr>
-      <w:r>
-        <w:t>Territorio y población</w:t>
-      </w:r>
-    </w:p>
-    <w:p>
-      <w:pPr>
         <w:jc w:val="both"/>
       </w:pPr>
       <w:r>
         <w:rPr>
           <w:rFonts w:ascii="Calibri" w:hAnsi="Calibri" w:eastAsia="Calibri"/>
-          <w:b/>
           <w:color w:val="203740"/>
-          <w:sz w:val="21"/>
+          <w:sz w:val="18"/>
         </w:rPr>
-        <w:t>Dato observado.</w:t>
-      </w:r>
-      <w:r>
-        <w:rPr>
-          <w:rFonts w:ascii="Calibri" w:hAnsi="Calibri" w:eastAsia="Calibri"/>
-          <w:color w:val="203740"/>
-          <w:sz w:val="21"/>
-        </w:rPr>
-        <w:t xml:space="preserve"> Nagua concentra 52.0% de la población provincial; Cabrera, El Factor y Río San Juan reúnen el resto. El agregado no muestra por sí mismo tiempos de viaje, conectividad, dispersión rural, exposición a riesgos ni acceso real a servicios.</w:t>
+        <w:t>La comparación separa el dato disponible de la verificación que debe realizar la comisión técnica antes de que el CDP formule prioridades.</w:t>
       </w:r>
     </w:p>
-    <w:p>
-      <w:pPr>
-        <w:jc w:val="both"/>
-      </w:pPr>
-      <w:r>
-        <w:rPr>
-          <w:rFonts w:ascii="Calibri" w:hAnsi="Calibri" w:eastAsia="Calibri"/>
-          <w:b/>
-          <w:color w:val="203740"/>
-          <w:sz w:val="21"/>
-        </w:rPr>
-        <w:t>Verificación requerida.</w:t>
-      </w:r>
-      <w:r>
-        <w:rPr>
-          <w:rFonts w:ascii="Calibri" w:hAnsi="Calibri" w:eastAsia="Calibri"/>
-          <w:color w:val="203740"/>
-          <w:sz w:val="21"/>
-        </w:rPr>
-        <w:t xml:space="preserve"> Localizar comunidades, corredores, cuencas y equipamientos compartidos; verificar cómo cambian las necesidades entre zonas urbanas y rurales.</w:t>
-      </w:r>
-    </w:p>
-    <w:p>
-      <w:pPr>
-        <w:pStyle w:val="Heading2"/>
-      </w:pPr>
-      <w:r>
-        <w:t>Servicios básicos</w:t>
-      </w:r>
-    </w:p>
-    <w:p>
-      <w:pPr>
-        <w:jc w:val="both"/>
-      </w:pPr>
-      <w:r>
-        <w:rPr>
-          <w:rFonts w:ascii="Calibri" w:hAnsi="Calibri" w:eastAsia="Calibri"/>
-          <w:b/>
-          <w:color w:val="203740"/>
-          <w:sz w:val="21"/>
-        </w:rPr>
-        <w:t>Dato observado.</w:t>
-      </w:r>
-      <w:r>
-        <w:rPr>
-          <w:rFonts w:ascii="Calibri" w:hAnsi="Calibri" w:eastAsia="Calibri"/>
-          <w:color w:val="203740"/>
-          <w:sz w:val="21"/>
-        </w:rPr>
-        <w:t xml:space="preserve"> El Censo registra 61.0% de hogares con agua del acueducto dentro de la vivienda, 78.7% con inodoro y 79.5% con recogida municipal de residuos. Las diferencias entre municipios son visibles.</w:t>
-      </w:r>
-    </w:p>
-    <w:p>
-      <w:pPr>
-        <w:jc w:val="both"/>
-      </w:pPr>
-      <w:r>
-        <w:rPr>
-          <w:rFonts w:ascii="Calibri" w:hAnsi="Calibri" w:eastAsia="Calibri"/>
-          <w:b/>
-          <w:color w:val="203740"/>
-          <w:sz w:val="21"/>
-        </w:rPr>
-        <w:t>Verificación requerida.</w:t>
-      </w:r>
-      <w:r>
-        <w:rPr>
-          <w:rFonts w:ascii="Calibri" w:hAnsi="Calibri" w:eastAsia="Calibri"/>
-          <w:color w:val="203740"/>
-          <w:sz w:val="21"/>
-        </w:rPr>
-        <w:t xml:space="preserve"> Comprobar continuidad, presión, potabilidad, frecuencia, rutas, disposición final, costo y población no servida; distinguir competencias municipales y sectoriales.</w:t>
-      </w:r>
-    </w:p>
-    <w:p>
-      <w:pPr>
-        <w:pStyle w:val="Heading2"/>
-      </w:pPr>
-      <w:r>
-        <w:t>Condiciones sociales</w:t>
-      </w:r>
-    </w:p>
-    <w:p>
-      <w:pPr>
-        <w:jc w:val="both"/>
-      </w:pPr>
-      <w:r>
-        <w:rPr>
-          <w:rFonts w:ascii="Calibri" w:hAnsi="Calibri" w:eastAsia="Calibri"/>
-          <w:b/>
-          <w:color w:val="203740"/>
-          <w:sz w:val="21"/>
-        </w:rPr>
-        <w:t>Dato observado.</w:t>
-      </w:r>
-      <w:r>
-        <w:rPr>
-          <w:rFonts w:ascii="Calibri" w:hAnsi="Calibri" w:eastAsia="Calibri"/>
-          <w:color w:val="203740"/>
-          <w:sz w:val="21"/>
-        </w:rPr>
-        <w:t xml:space="preserve"> Los registros 2026 muestran 3.9% de hacinamiento extremo y 9.7% moderado; 13 centros INAIPI y 70.7% de asistencia registrada; 13,064 personas con discapacidad distribuidas por ICV.</w:t>
-      </w:r>
-    </w:p>
-    <w:p>
-      <w:pPr>
-        <w:jc w:val="both"/>
-      </w:pPr>
-      <w:r>
-        <w:rPr>
-          <w:rFonts w:ascii="Calibri" w:hAnsi="Calibri" w:eastAsia="Calibri"/>
-          <w:b/>
-          <w:color w:val="203740"/>
-          <w:sz w:val="21"/>
-        </w:rPr>
-        <w:t>Verificación requerida.</w:t>
-      </w:r>
-      <w:r>
-        <w:rPr>
-          <w:rFonts w:ascii="Calibri" w:hAnsi="Calibri" w:eastAsia="Calibri"/>
-          <w:color w:val="203740"/>
-          <w:sz w:val="21"/>
-        </w:rPr>
-        <w:t xml:space="preserve"> Revisar definiciones, evitar tratar presencias como personas únicas y localizar barreras específicas antes de definir población objetivo.</w:t>
-      </w:r>
-    </w:p>
-    <w:p>
-      <w:pPr>
-        <w:pStyle w:val="Heading2"/>
-      </w:pPr>
-      <w:r>
-        <w:t>Seguridad y movilidad</w:t>
-      </w:r>
-    </w:p>
-    <w:p>
-      <w:pPr>
-        <w:jc w:val="both"/>
-      </w:pPr>
-      <w:r>
-        <w:rPr>
-          <w:rFonts w:ascii="Calibri" w:hAnsi="Calibri" w:eastAsia="Calibri"/>
-          <w:b/>
-          <w:color w:val="203740"/>
-          <w:sz w:val="21"/>
-        </w:rPr>
-        <w:t>Dato observado.</w:t>
-      </w:r>
-      <w:r>
-        <w:rPr>
-          <w:rFonts w:ascii="Calibri" w:hAnsi="Calibri" w:eastAsia="Calibri"/>
-          <w:color w:val="203740"/>
-          <w:sz w:val="21"/>
-        </w:rPr>
-        <w:t xml:space="preserve"> La tasa de homicidios fue 8.3 por 100 mil en 2024. La tasa de muertes de tránsito fue 32.6 por 100 mil en 2025, con variación anual considerable.</w:t>
-      </w:r>
-    </w:p>
-    <w:p>
-      <w:pPr>
-        <w:jc w:val="both"/>
-      </w:pPr>
-      <w:r>
-        <w:rPr>
-          <w:rFonts w:ascii="Calibri" w:hAnsi="Calibri" w:eastAsia="Calibri"/>
-          <w:b/>
-          <w:color w:val="203740"/>
-          <w:sz w:val="21"/>
-        </w:rPr>
-        <w:t>Verificación requerida.</w:t>
-      </w:r>
-      <w:r>
-        <w:rPr>
-          <w:rFonts w:ascii="Calibri" w:hAnsi="Calibri" w:eastAsia="Calibri"/>
-          <w:color w:val="203740"/>
-          <w:sz w:val="21"/>
-        </w:rPr>
-        <w:t xml:space="preserve"> Desagregar eventos por lugar, vía, horario, sexo, edad y circunstancia; contrastar infraestructura, control, educación y respuesta de emergencia.</w:t>
-      </w:r>
-    </w:p>
-    <w:p>
-      <w:pPr>
-        <w:pStyle w:val="Heading2"/>
-      </w:pPr>
-      <w:r>
-        <w:t>Educación y economía</w:t>
-      </w:r>
-    </w:p>
-    <w:p>
-      <w:pPr>
-        <w:jc w:val="both"/>
-      </w:pPr>
-      <w:r>
-        <w:rPr>
-          <w:rFonts w:ascii="Calibri" w:hAnsi="Calibri" w:eastAsia="Calibri"/>
-          <w:b/>
-          <w:color w:val="203740"/>
-          <w:sz w:val="21"/>
-        </w:rPr>
-        <w:t>Dato observado.</w:t>
-      </w:r>
-      <w:r>
-        <w:rPr>
-          <w:rFonts w:ascii="Calibri" w:hAnsi="Calibri" w:eastAsia="Calibri"/>
-          <w:color w:val="203740"/>
-          <w:sz w:val="21"/>
-        </w:rPr>
-        <w:t xml:space="preserve"> El Anuario 2024 reporta 87.0% de promoción, 5.9% de abandono y 7.1% de reprobación en secundaria. El DEE registra 1,289 establecimientos y empleo estimado de 9,818 personas.</w:t>
-      </w:r>
-    </w:p>
-    <w:p>
-      <w:pPr>
-        <w:jc w:val="both"/>
-      </w:pPr>
-      <w:r>
-        <w:rPr>
-          <w:rFonts w:ascii="Calibri" w:hAnsi="Calibri" w:eastAsia="Calibri"/>
-          <w:b/>
-          <w:color w:val="203740"/>
-          <w:sz w:val="21"/>
-        </w:rPr>
-        <w:t>Verificación requerida.</w:t>
-      </w:r>
-      <w:r>
-        <w:rPr>
-          <w:rFonts w:ascii="Calibri" w:hAnsi="Calibri" w:eastAsia="Calibri"/>
-          <w:color w:val="203740"/>
-          <w:sz w:val="21"/>
-        </w:rPr>
-        <w:t xml:space="preserve"> Validar distritos educativos y evitar representar el DEE como totalidad de la economía, pues no cubre adecuadamente informalidad, autoempleo ni producción agropecuaria familiar.</w:t>
-      </w:r>
-    </w:p>
-    <w:p>
-      <w:pPr>
-        <w:pStyle w:val="Heading2"/>
-      </w:pPr>
-      <w:r>
-        <w:t>Inversión y demandas</w:t>
-      </w:r>
-    </w:p>
-    <w:p>
-      <w:pPr>
-        <w:jc w:val="both"/>
-      </w:pPr>
-      <w:r>
-        <w:rPr>
-          <w:rFonts w:ascii="Calibri" w:hAnsi="Calibri" w:eastAsia="Calibri"/>
-          <w:b/>
-          <w:color w:val="203740"/>
-          <w:sz w:val="21"/>
-        </w:rPr>
-        <w:t>Dato observado.</w:t>
-      </w:r>
-      <w:r>
-        <w:rPr>
-          <w:rFonts w:ascii="Calibri" w:hAnsi="Calibri" w:eastAsia="Calibri"/>
-          <w:color w:val="203740"/>
-          <w:sz w:val="21"/>
-        </w:rPr>
-        <w:t xml:space="preserve"> El corte 2026 asocia 50 proyectos, RD$4.83 mil millones de presupuesto y 42.8% de ejecución registrada. El consolidado del CDP incluye diez demandas.</w:t>
-      </w:r>
-    </w:p>
-    <w:p>
-      <w:pPr>
-        <w:jc w:val="both"/>
-      </w:pPr>
-      <w:r>
-        <w:rPr>
-          <w:rFonts w:ascii="Calibri" w:hAnsi="Calibri" w:eastAsia="Calibri"/>
-          <w:b/>
-          <w:color w:val="203740"/>
-          <w:sz w:val="21"/>
-        </w:rPr>
-        <w:t>Verificación requerida.</w:t>
-      </w:r>
-      <w:r>
-        <w:rPr>
-          <w:rFonts w:ascii="Calibri" w:hAnsi="Calibri" w:eastAsia="Calibri"/>
-          <w:color w:val="203740"/>
-          <w:sz w:val="21"/>
-        </w:rPr>
-        <w:t xml:space="preserve"> Revisar localización, estado, duplicidades, contratos, madurez técnica, código SNIP, financiamiento y relación con brechas; no equiparar demanda, proyecto aprobado e inversión ejecutada.</w:t>
-      </w:r>
-    </w:p>
+    <w:tbl>
+      <w:tblPr>
+        <w:tblW w:type="auto" w:w="0"/>
+        <w:jc w:val="center"/>
+        <w:tblLayout w:type="fixed"/>
+        <w:tblLook w:firstColumn="1" w:firstRow="1" w:lastColumn="0" w:lastRow="0" w:noHBand="0" w:noVBand="1" w:val="04A0"/>
+      </w:tblPr>
+      <w:tblGrid>
+        <w:gridCol w:w="3120"/>
+        <w:gridCol w:w="3120"/>
+        <w:gridCol w:w="3120"/>
+      </w:tblGrid>
+      <w:tr>
+        <w:trPr>
+          <w:tblHeader w:val="true"/>
+        </w:trPr>
+        <w:tc>
+          <w:tcPr>
+            <w:tcW w:type="dxa" w:w="1728"/>
+            <w:tcMar>
+              <w:top w:w="70" w:type="dxa"/>
+              <w:start w:w="90" w:type="dxa"/>
+              <w:bottom w:w="70" w:type="dxa"/>
+              <w:end w:w="90" w:type="dxa"/>
+            </w:tcMar>
+            <w:vAlign w:val="center"/>
+            <w:shd w:fill="203740"/>
+          </w:tcPr>
+          <w:p>
+            <w:pPr>
+              <w:spacing w:after="0" w:line="252" w:lineRule="auto"/>
+              <w:jc w:val="left"/>
+            </w:pPr>
+            <w:r>
+              <w:rPr>
+                <w:rFonts w:ascii="Calibri" w:hAnsi="Calibri" w:eastAsia="Calibri"/>
+                <w:b/>
+                <w:color w:val="FFFFFF"/>
+                <w:sz w:val="14"/>
+              </w:rPr>
+              <w:t>Tema</w:t>
+            </w:r>
+          </w:p>
+        </w:tc>
+        <w:tc>
+          <w:tcPr>
+            <w:tcW w:type="dxa" w:w="3960"/>
+            <w:tcMar>
+              <w:top w:w="70" w:type="dxa"/>
+              <w:start w:w="90" w:type="dxa"/>
+              <w:bottom w:w="70" w:type="dxa"/>
+              <w:end w:w="90" w:type="dxa"/>
+            </w:tcMar>
+            <w:vAlign w:val="center"/>
+            <w:shd w:fill="203740"/>
+          </w:tcPr>
+          <w:p>
+            <w:pPr>
+              <w:spacing w:after="0" w:line="252" w:lineRule="auto"/>
+              <w:jc w:val="left"/>
+            </w:pPr>
+            <w:r>
+              <w:rPr>
+                <w:rFonts w:ascii="Calibri" w:hAnsi="Calibri" w:eastAsia="Calibri"/>
+                <w:b/>
+                <w:color w:val="FFFFFF"/>
+                <w:sz w:val="14"/>
+              </w:rPr>
+              <w:t>Dato observado</w:t>
+            </w:r>
+          </w:p>
+        </w:tc>
+        <w:tc>
+          <w:tcPr>
+            <w:tcW w:type="dxa" w:w="3672"/>
+            <w:tcMar>
+              <w:top w:w="70" w:type="dxa"/>
+              <w:start w:w="90" w:type="dxa"/>
+              <w:bottom w:w="70" w:type="dxa"/>
+              <w:end w:w="90" w:type="dxa"/>
+            </w:tcMar>
+            <w:vAlign w:val="center"/>
+            <w:shd w:fill="203740"/>
+          </w:tcPr>
+          <w:p>
+            <w:pPr>
+              <w:spacing w:after="0" w:line="252" w:lineRule="auto"/>
+              <w:jc w:val="left"/>
+            </w:pPr>
+            <w:r>
+              <w:rPr>
+                <w:rFonts w:ascii="Calibri" w:hAnsi="Calibri" w:eastAsia="Calibri"/>
+                <w:b/>
+                <w:color w:val="FFFFFF"/>
+                <w:sz w:val="14"/>
+              </w:rPr>
+              <w:t>Verificación requerida</w:t>
+            </w:r>
+          </w:p>
+        </w:tc>
+      </w:tr>
+      <w:tr>
+        <w:tc>
+          <w:tcPr>
+            <w:tcW w:type="dxa" w:w="1728"/>
+            <w:tcMar>
+              <w:top w:w="70" w:type="dxa"/>
+              <w:start w:w="90" w:type="dxa"/>
+              <w:bottom w:w="70" w:type="dxa"/>
+              <w:end w:w="90" w:type="dxa"/>
+            </w:tcMar>
+            <w:vAlign w:val="center"/>
+          </w:tcPr>
+          <w:p>
+            <w:pPr>
+              <w:spacing w:after="0" w:line="252" w:lineRule="auto"/>
+              <w:jc w:val="left"/>
+            </w:pPr>
+            <w:r>
+              <w:rPr>
+                <w:rFonts w:ascii="Calibri" w:hAnsi="Calibri" w:eastAsia="Calibri"/>
+                <w:color w:val="203740"/>
+                <w:sz w:val="14"/>
+              </w:rPr>
+              <w:t>Territorio y población</w:t>
+            </w:r>
+          </w:p>
+        </w:tc>
+        <w:tc>
+          <w:tcPr>
+            <w:tcW w:type="dxa" w:w="3960"/>
+            <w:tcMar>
+              <w:top w:w="70" w:type="dxa"/>
+              <w:start w:w="90" w:type="dxa"/>
+              <w:bottom w:w="70" w:type="dxa"/>
+              <w:end w:w="90" w:type="dxa"/>
+            </w:tcMar>
+            <w:vAlign w:val="center"/>
+          </w:tcPr>
+          <w:p>
+            <w:pPr>
+              <w:spacing w:after="0" w:line="252" w:lineRule="auto"/>
+              <w:jc w:val="left"/>
+            </w:pPr>
+            <w:r>
+              <w:rPr>
+                <w:rFonts w:ascii="Calibri" w:hAnsi="Calibri" w:eastAsia="Calibri"/>
+                <w:color w:val="203740"/>
+                <w:sz w:val="14"/>
+              </w:rPr>
+              <w:t>Nagua concentra 52.0% de la población provincial; los otros 3 municipios reúnen el resto. El agregado no muestra por sí mismo tiempos de viaje, conectividad, dispersión rural, exposición a riesgos ni acceso real a servicios.</w:t>
+            </w:r>
+          </w:p>
+        </w:tc>
+        <w:tc>
+          <w:tcPr>
+            <w:tcW w:type="dxa" w:w="3672"/>
+            <w:tcMar>
+              <w:top w:w="70" w:type="dxa"/>
+              <w:start w:w="90" w:type="dxa"/>
+              <w:bottom w:w="70" w:type="dxa"/>
+              <w:end w:w="90" w:type="dxa"/>
+            </w:tcMar>
+            <w:vAlign w:val="center"/>
+          </w:tcPr>
+          <w:p>
+            <w:pPr>
+              <w:spacing w:after="0" w:line="252" w:lineRule="auto"/>
+              <w:jc w:val="left"/>
+            </w:pPr>
+            <w:r>
+              <w:rPr>
+                <w:rFonts w:ascii="Calibri" w:hAnsi="Calibri" w:eastAsia="Calibri"/>
+                <w:color w:val="203740"/>
+                <w:sz w:val="14"/>
+              </w:rPr>
+              <w:t>Localizar comunidades, corredores, cuencas y equipamientos compartidos; verificar cómo cambian las necesidades entre zonas urbanas y rurales.</w:t>
+            </w:r>
+          </w:p>
+        </w:tc>
+      </w:tr>
+      <w:tr>
+        <w:tc>
+          <w:tcPr>
+            <w:tcW w:type="dxa" w:w="1728"/>
+            <w:tcMar>
+              <w:top w:w="70" w:type="dxa"/>
+              <w:start w:w="90" w:type="dxa"/>
+              <w:bottom w:w="70" w:type="dxa"/>
+              <w:end w:w="90" w:type="dxa"/>
+            </w:tcMar>
+            <w:vAlign w:val="center"/>
+            <w:shd w:fill="F3F6F6"/>
+          </w:tcPr>
+          <w:p>
+            <w:pPr>
+              <w:spacing w:after="0" w:line="252" w:lineRule="auto"/>
+              <w:jc w:val="left"/>
+            </w:pPr>
+            <w:r>
+              <w:rPr>
+                <w:rFonts w:ascii="Calibri" w:hAnsi="Calibri" w:eastAsia="Calibri"/>
+                <w:color w:val="203740"/>
+                <w:sz w:val="14"/>
+              </w:rPr>
+              <w:t>Servicios básicos</w:t>
+            </w:r>
+          </w:p>
+        </w:tc>
+        <w:tc>
+          <w:tcPr>
+            <w:tcW w:type="dxa" w:w="3960"/>
+            <w:tcMar>
+              <w:top w:w="70" w:type="dxa"/>
+              <w:start w:w="90" w:type="dxa"/>
+              <w:bottom w:w="70" w:type="dxa"/>
+              <w:end w:w="90" w:type="dxa"/>
+            </w:tcMar>
+            <w:vAlign w:val="center"/>
+            <w:shd w:fill="F3F6F6"/>
+          </w:tcPr>
+          <w:p>
+            <w:pPr>
+              <w:spacing w:after="0" w:line="252" w:lineRule="auto"/>
+              <w:jc w:val="left"/>
+            </w:pPr>
+            <w:r>
+              <w:rPr>
+                <w:rFonts w:ascii="Calibri" w:hAnsi="Calibri" w:eastAsia="Calibri"/>
+                <w:color w:val="203740"/>
+                <w:sz w:val="14"/>
+              </w:rPr>
+              <w:t>El Censo registra 61.0% de hogares con agua del acueducto dentro de la vivienda, 78.7% con inodoro y 79.5% con recogida municipal de residuos. La lámina permite contrastar los municipios de mayor población.</w:t>
+            </w:r>
+          </w:p>
+        </w:tc>
+        <w:tc>
+          <w:tcPr>
+            <w:tcW w:type="dxa" w:w="3672"/>
+            <w:tcMar>
+              <w:top w:w="70" w:type="dxa"/>
+              <w:start w:w="90" w:type="dxa"/>
+              <w:bottom w:w="70" w:type="dxa"/>
+              <w:end w:w="90" w:type="dxa"/>
+            </w:tcMar>
+            <w:vAlign w:val="center"/>
+            <w:shd w:fill="F3F6F6"/>
+          </w:tcPr>
+          <w:p>
+            <w:pPr>
+              <w:spacing w:after="0" w:line="252" w:lineRule="auto"/>
+              <w:jc w:val="left"/>
+            </w:pPr>
+            <w:r>
+              <w:rPr>
+                <w:rFonts w:ascii="Calibri" w:hAnsi="Calibri" w:eastAsia="Calibri"/>
+                <w:color w:val="203740"/>
+                <w:sz w:val="14"/>
+              </w:rPr>
+              <w:t>Comprobar continuidad, presión, potabilidad, frecuencia, rutas, disposición final, costo y población no servida; distinguir competencias municipales y sectoriales.</w:t>
+            </w:r>
+          </w:p>
+        </w:tc>
+      </w:tr>
+      <w:tr>
+        <w:tc>
+          <w:tcPr>
+            <w:tcW w:type="dxa" w:w="1728"/>
+            <w:tcMar>
+              <w:top w:w="70" w:type="dxa"/>
+              <w:start w:w="90" w:type="dxa"/>
+              <w:bottom w:w="70" w:type="dxa"/>
+              <w:end w:w="90" w:type="dxa"/>
+            </w:tcMar>
+            <w:vAlign w:val="center"/>
+          </w:tcPr>
+          <w:p>
+            <w:pPr>
+              <w:spacing w:after="0" w:line="252" w:lineRule="auto"/>
+              <w:jc w:val="left"/>
+            </w:pPr>
+            <w:r>
+              <w:rPr>
+                <w:rFonts w:ascii="Calibri" w:hAnsi="Calibri" w:eastAsia="Calibri"/>
+                <w:color w:val="203740"/>
+                <w:sz w:val="14"/>
+              </w:rPr>
+              <w:t>Condiciones sociales</w:t>
+            </w:r>
+          </w:p>
+        </w:tc>
+        <w:tc>
+          <w:tcPr>
+            <w:tcW w:type="dxa" w:w="3960"/>
+            <w:tcMar>
+              <w:top w:w="70" w:type="dxa"/>
+              <w:start w:w="90" w:type="dxa"/>
+              <w:bottom w:w="70" w:type="dxa"/>
+              <w:end w:w="90" w:type="dxa"/>
+            </w:tcMar>
+            <w:vAlign w:val="center"/>
+          </w:tcPr>
+          <w:p>
+            <w:pPr>
+              <w:spacing w:after="0" w:line="252" w:lineRule="auto"/>
+              <w:jc w:val="left"/>
+            </w:pPr>
+            <w:r>
+              <w:rPr>
+                <w:rFonts w:ascii="Calibri" w:hAnsi="Calibri" w:eastAsia="Calibri"/>
+                <w:color w:val="203740"/>
+                <w:sz w:val="14"/>
+              </w:rPr>
+              <w:t>Los registros 2026 muestran 3.9% de hacinamiento extremo y 9.7% moderado; 13 centros INAIPI y 70.7% de asistencia registrada; 13,064 personas con discapacidad distribuidas por ICV.</w:t>
+            </w:r>
+          </w:p>
+        </w:tc>
+        <w:tc>
+          <w:tcPr>
+            <w:tcW w:type="dxa" w:w="3672"/>
+            <w:tcMar>
+              <w:top w:w="70" w:type="dxa"/>
+              <w:start w:w="90" w:type="dxa"/>
+              <w:bottom w:w="70" w:type="dxa"/>
+              <w:end w:w="90" w:type="dxa"/>
+            </w:tcMar>
+            <w:vAlign w:val="center"/>
+          </w:tcPr>
+          <w:p>
+            <w:pPr>
+              <w:spacing w:after="0" w:line="252" w:lineRule="auto"/>
+              <w:jc w:val="left"/>
+            </w:pPr>
+            <w:r>
+              <w:rPr>
+                <w:rFonts w:ascii="Calibri" w:hAnsi="Calibri" w:eastAsia="Calibri"/>
+                <w:color w:val="203740"/>
+                <w:sz w:val="14"/>
+              </w:rPr>
+              <w:t>Revisar definiciones, evitar tratar presencias como personas únicas y localizar barreras específicas antes de definir población objetivo.</w:t>
+            </w:r>
+          </w:p>
+        </w:tc>
+      </w:tr>
+      <w:tr>
+        <w:tc>
+          <w:tcPr>
+            <w:tcW w:type="dxa" w:w="1728"/>
+            <w:tcMar>
+              <w:top w:w="70" w:type="dxa"/>
+              <w:start w:w="90" w:type="dxa"/>
+              <w:bottom w:w="70" w:type="dxa"/>
+              <w:end w:w="90" w:type="dxa"/>
+            </w:tcMar>
+            <w:vAlign w:val="center"/>
+            <w:shd w:fill="F3F6F6"/>
+          </w:tcPr>
+          <w:p>
+            <w:pPr>
+              <w:spacing w:after="0" w:line="252" w:lineRule="auto"/>
+              <w:jc w:val="left"/>
+            </w:pPr>
+            <w:r>
+              <w:rPr>
+                <w:rFonts w:ascii="Calibri" w:hAnsi="Calibri" w:eastAsia="Calibri"/>
+                <w:color w:val="203740"/>
+                <w:sz w:val="14"/>
+              </w:rPr>
+              <w:t>Seguridad y movilidad</w:t>
+            </w:r>
+          </w:p>
+        </w:tc>
+        <w:tc>
+          <w:tcPr>
+            <w:tcW w:type="dxa" w:w="3960"/>
+            <w:tcMar>
+              <w:top w:w="70" w:type="dxa"/>
+              <w:start w:w="90" w:type="dxa"/>
+              <w:bottom w:w="70" w:type="dxa"/>
+              <w:end w:w="90" w:type="dxa"/>
+            </w:tcMar>
+            <w:vAlign w:val="center"/>
+            <w:shd w:fill="F3F6F6"/>
+          </w:tcPr>
+          <w:p>
+            <w:pPr>
+              <w:spacing w:after="0" w:line="252" w:lineRule="auto"/>
+              <w:jc w:val="left"/>
+            </w:pPr>
+            <w:r>
+              <w:rPr>
+                <w:rFonts w:ascii="Calibri" w:hAnsi="Calibri" w:eastAsia="Calibri"/>
+                <w:color w:val="203740"/>
+                <w:sz w:val="14"/>
+              </w:rPr>
+              <w:t>La tasa de homicidios fue 8.3 por 100 mil en 2024. La tasa de muertes de tránsito fue 32.6 por 100 mil en 2025, dentro de una serie con variación anual.</w:t>
+            </w:r>
+          </w:p>
+        </w:tc>
+        <w:tc>
+          <w:tcPr>
+            <w:tcW w:type="dxa" w:w="3672"/>
+            <w:tcMar>
+              <w:top w:w="70" w:type="dxa"/>
+              <w:start w:w="90" w:type="dxa"/>
+              <w:bottom w:w="70" w:type="dxa"/>
+              <w:end w:w="90" w:type="dxa"/>
+            </w:tcMar>
+            <w:vAlign w:val="center"/>
+            <w:shd w:fill="F3F6F6"/>
+          </w:tcPr>
+          <w:p>
+            <w:pPr>
+              <w:spacing w:after="0" w:line="252" w:lineRule="auto"/>
+              <w:jc w:val="left"/>
+            </w:pPr>
+            <w:r>
+              <w:rPr>
+                <w:rFonts w:ascii="Calibri" w:hAnsi="Calibri" w:eastAsia="Calibri"/>
+                <w:color w:val="203740"/>
+                <w:sz w:val="14"/>
+              </w:rPr>
+              <w:t>Desagregar eventos por lugar, vía, horario, sexo, edad y circunstancia; contrastar infraestructura, control, educación y respuesta de emergencia.</w:t>
+            </w:r>
+          </w:p>
+        </w:tc>
+      </w:tr>
+      <w:tr>
+        <w:tc>
+          <w:tcPr>
+            <w:tcW w:type="dxa" w:w="1728"/>
+            <w:tcMar>
+              <w:top w:w="70" w:type="dxa"/>
+              <w:start w:w="90" w:type="dxa"/>
+              <w:bottom w:w="70" w:type="dxa"/>
+              <w:end w:w="90" w:type="dxa"/>
+            </w:tcMar>
+            <w:vAlign w:val="center"/>
+          </w:tcPr>
+          <w:p>
+            <w:pPr>
+              <w:spacing w:after="0" w:line="252" w:lineRule="auto"/>
+              <w:jc w:val="left"/>
+            </w:pPr>
+            <w:r>
+              <w:rPr>
+                <w:rFonts w:ascii="Calibri" w:hAnsi="Calibri" w:eastAsia="Calibri"/>
+                <w:color w:val="203740"/>
+                <w:sz w:val="14"/>
+              </w:rPr>
+              <w:t>Educación y economía</w:t>
+            </w:r>
+          </w:p>
+        </w:tc>
+        <w:tc>
+          <w:tcPr>
+            <w:tcW w:type="dxa" w:w="3960"/>
+            <w:tcMar>
+              <w:top w:w="70" w:type="dxa"/>
+              <w:start w:w="90" w:type="dxa"/>
+              <w:bottom w:w="70" w:type="dxa"/>
+              <w:end w:w="90" w:type="dxa"/>
+            </w:tcMar>
+            <w:vAlign w:val="center"/>
+          </w:tcPr>
+          <w:p>
+            <w:pPr>
+              <w:spacing w:after="0" w:line="252" w:lineRule="auto"/>
+              <w:jc w:val="left"/>
+            </w:pPr>
+            <w:r>
+              <w:rPr>
+                <w:rFonts w:ascii="Calibri" w:hAnsi="Calibri" w:eastAsia="Calibri"/>
+                <w:color w:val="203740"/>
+                <w:sz w:val="14"/>
+              </w:rPr>
+              <w:t>El Anuario 2024 reporta 87.0% de promoción, 5.9% de abandono y 7.0% de reprobación en secundaria. El DEE registra 1,289 establecimientos y empleo estimado de 9,818 personas.</w:t>
+            </w:r>
+          </w:p>
+        </w:tc>
+        <w:tc>
+          <w:tcPr>
+            <w:tcW w:type="dxa" w:w="3672"/>
+            <w:tcMar>
+              <w:top w:w="70" w:type="dxa"/>
+              <w:start w:w="90" w:type="dxa"/>
+              <w:bottom w:w="70" w:type="dxa"/>
+              <w:end w:w="90" w:type="dxa"/>
+            </w:tcMar>
+            <w:vAlign w:val="center"/>
+          </w:tcPr>
+          <w:p>
+            <w:pPr>
+              <w:spacing w:after="0" w:line="252" w:lineRule="auto"/>
+              <w:jc w:val="left"/>
+            </w:pPr>
+            <w:r>
+              <w:rPr>
+                <w:rFonts w:ascii="Calibri" w:hAnsi="Calibri" w:eastAsia="Calibri"/>
+                <w:color w:val="203740"/>
+                <w:sz w:val="14"/>
+              </w:rPr>
+              <w:t>Validar distritos educativos y evitar representar el DEE como totalidad de la economía, pues no cubre adecuadamente informalidad, autoempleo ni producción agropecuaria familiar.</w:t>
+            </w:r>
+          </w:p>
+        </w:tc>
+      </w:tr>
+      <w:tr>
+        <w:tc>
+          <w:tcPr>
+            <w:tcW w:type="dxa" w:w="1728"/>
+            <w:tcMar>
+              <w:top w:w="70" w:type="dxa"/>
+              <w:start w:w="90" w:type="dxa"/>
+              <w:bottom w:w="70" w:type="dxa"/>
+              <w:end w:w="90" w:type="dxa"/>
+            </w:tcMar>
+            <w:vAlign w:val="center"/>
+            <w:shd w:fill="F3F6F6"/>
+          </w:tcPr>
+          <w:p>
+            <w:pPr>
+              <w:spacing w:after="0" w:line="252" w:lineRule="auto"/>
+              <w:jc w:val="left"/>
+            </w:pPr>
+            <w:r>
+              <w:rPr>
+                <w:rFonts w:ascii="Calibri" w:hAnsi="Calibri" w:eastAsia="Calibri"/>
+                <w:color w:val="203740"/>
+                <w:sz w:val="14"/>
+              </w:rPr>
+              <w:t>Inversión y demandas</w:t>
+            </w:r>
+          </w:p>
+        </w:tc>
+        <w:tc>
+          <w:tcPr>
+            <w:tcW w:type="dxa" w:w="3960"/>
+            <w:tcMar>
+              <w:top w:w="70" w:type="dxa"/>
+              <w:start w:w="90" w:type="dxa"/>
+              <w:bottom w:w="70" w:type="dxa"/>
+              <w:end w:w="90" w:type="dxa"/>
+            </w:tcMar>
+            <w:vAlign w:val="center"/>
+            <w:shd w:fill="F3F6F6"/>
+          </w:tcPr>
+          <w:p>
+            <w:pPr>
+              <w:spacing w:after="0" w:line="252" w:lineRule="auto"/>
+              <w:jc w:val="left"/>
+            </w:pPr>
+            <w:r>
+              <w:rPr>
+                <w:rFonts w:ascii="Calibri" w:hAnsi="Calibri" w:eastAsia="Calibri"/>
+                <w:color w:val="203740"/>
+                <w:sz w:val="14"/>
+              </w:rPr>
+              <w:t>El corte 2026 asocia 50 proyectos, RD$4.83 mil millones de presupuesto y 42.8% de ejecución registrada. El consolidado del CDP incluye 10 demandas.</w:t>
+            </w:r>
+          </w:p>
+        </w:tc>
+        <w:tc>
+          <w:tcPr>
+            <w:tcW w:type="dxa" w:w="3672"/>
+            <w:tcMar>
+              <w:top w:w="70" w:type="dxa"/>
+              <w:start w:w="90" w:type="dxa"/>
+              <w:bottom w:w="70" w:type="dxa"/>
+              <w:end w:w="90" w:type="dxa"/>
+            </w:tcMar>
+            <w:vAlign w:val="center"/>
+            <w:shd w:fill="F3F6F6"/>
+          </w:tcPr>
+          <w:p>
+            <w:pPr>
+              <w:spacing w:after="0" w:line="252" w:lineRule="auto"/>
+              <w:jc w:val="left"/>
+            </w:pPr>
+            <w:r>
+              <w:rPr>
+                <w:rFonts w:ascii="Calibri" w:hAnsi="Calibri" w:eastAsia="Calibri"/>
+                <w:color w:val="203740"/>
+                <w:sz w:val="14"/>
+              </w:rPr>
+              <w:t>Revisar localización, estado, duplicidades, contratos, madurez técnica, código SNIP, financiamiento y relación con brechas; no equiparar demanda, proyecto aprobado e inversión ejecutada.</w:t>
+            </w:r>
+          </w:p>
+        </w:tc>
+      </w:tr>
+    </w:tbl>
     <w:p>
       <w:r>
         <w:br w:type="page"/>
@@ -4761,7 +5053,7 @@
                 <w:color w:val="203740"/>
                 <w:sz w:val="14"/>
               </w:rPr>
-              <w:t>61 instalaciones deportivas; 39 de propiedad municipal; centros de salud presentes en los cuatro municipios.</w:t>
+              <w:t>61 instalaciones deportivas; 39 de propiedad municipal; 38 registros de centros de salud.</w:t>
             </w:r>
           </w:p>
         </w:tc>
@@ -5035,7 +5327,7 @@
                 <w:color w:val="203740"/>
                 <w:sz w:val="14"/>
               </w:rPr>
-              <w:t>Diez demandas priorizadas y consolidadas por el CDP en 2026.</w:t>
+              <w:t>10 demandas priorizadas y consolidadas por el CDP en 2026.</w:t>
             </w:r>
           </w:p>
         </w:tc>
@@ -5172,7 +5464,7 @@
                 <w:color w:val="203740"/>
                 <w:sz w:val="14"/>
               </w:rPr>
-              <w:t>61.0% con acueducto dentro; 78.7% con inodoro; diferencias municipales marcadas.</w:t>
+              <w:t>61.0% con acueducto dentro; 78.7% con inodoro; contraste disponible entre municipios.</w:t>
             </w:r>
           </w:p>
         </w:tc>
@@ -5309,7 +5601,7 @@
                 <w:color w:val="203740"/>
                 <w:sz w:val="14"/>
               </w:rPr>
-              <w:t>79.5% declara recogida municipal; 16.9% quema residuos; demandas incluyen drenaje y saneamiento.</w:t>
+              <w:t>79.5% declara recogida municipal y 16.9% quema residuos; las demandas deben contrastarse con estas categorías censales.</w:t>
             </w:r>
           </w:p>
         </w:tc>
@@ -7047,6 +7339,19 @@
         <w:t>4.3 Criterios de priorización a acordar</w:t>
       </w:r>
     </w:p>
+    <w:p>
+      <w:pPr>
+        <w:jc w:val="both"/>
+      </w:pPr>
+      <w:r>
+        <w:rPr>
+          <w:rFonts w:ascii="Calibri" w:hAnsi="Calibri" w:eastAsia="Calibri"/>
+          <w:color w:val="203740"/>
+          <w:sz w:val="18"/>
+        </w:rPr>
+        <w:t>El CDP completará la definición y el peso o regla de cada criterio durante la sesión de concertación.</w:t>
+      </w:r>
+    </w:p>
     <w:tbl>
       <w:tblPr>
         <w:tblW w:type="auto" w:w="0"/>
@@ -7197,7 +7502,6 @@
                 <w:color w:val="203740"/>
                 <w:sz w:val="16"/>
               </w:rPr>
-              <w:t>POR ACORDAR POR EL CDP</w:t>
             </w:r>
           </w:p>
         </w:tc>
@@ -7278,7 +7582,6 @@
                 <w:color w:val="203740"/>
                 <w:sz w:val="16"/>
               </w:rPr>
-              <w:t>POR ACORDAR POR EL CDP</w:t>
             </w:r>
           </w:p>
         </w:tc>
@@ -7358,7 +7661,6 @@
                 <w:color w:val="203740"/>
                 <w:sz w:val="16"/>
               </w:rPr>
-              <w:t>POR ACORDAR POR EL CDP</w:t>
             </w:r>
           </w:p>
         </w:tc>
@@ -7439,7 +7741,6 @@
                 <w:color w:val="203740"/>
                 <w:sz w:val="16"/>
               </w:rPr>
-              <w:t>POR ACORDAR POR EL CDP</w:t>
             </w:r>
           </w:p>
         </w:tc>
@@ -7519,7 +7820,6 @@
                 <w:color w:val="203740"/>
                 <w:sz w:val="16"/>
               </w:rPr>
-              <w:t>POR ACORDAR POR EL CDP</w:t>
             </w:r>
           </w:p>
         </w:tc>
@@ -7600,7 +7900,6 @@
                 <w:color w:val="203740"/>
                 <w:sz w:val="16"/>
               </w:rPr>
-              <w:t>POR ACORDAR POR EL CDP</w:t>
             </w:r>
           </w:p>
         </w:tc>
@@ -7827,7 +8126,6 @@
                 <w:color w:val="203740"/>
                 <w:sz w:val="18"/>
               </w:rPr>
-              <w:t>POR ACORDAR POR EL CDP</w:t>
             </w:r>
           </w:p>
         </w:tc>
@@ -7881,7 +8179,6 @@
                 <w:color w:val="203740"/>
                 <w:sz w:val="18"/>
               </w:rPr>
-              <w:t>POR ACORDAR POR EL CDP</w:t>
               <w:br/>
               <w:br/>
             </w:r>
@@ -7937,7 +8234,6 @@
                 <w:color w:val="203740"/>
                 <w:sz w:val="18"/>
               </w:rPr>
-              <w:t>POR ACORDAR POR EL CDP</w:t>
             </w:r>
           </w:p>
         </w:tc>
@@ -7991,7 +8287,6 @@
                 <w:color w:val="203740"/>
                 <w:sz w:val="18"/>
               </w:rPr>
-              <w:t>POR ACORDAR POR EL CDP</w:t>
             </w:r>
           </w:p>
         </w:tc>
@@ -8867,7 +9162,6 @@
                 <w:color w:val="203740"/>
                 <w:sz w:val="17"/>
               </w:rPr>
-              <w:t>POR ACORDAR POR EL CDP</w:t>
             </w:r>
           </w:p>
         </w:tc>
@@ -8921,7 +9215,6 @@
                 <w:color w:val="203740"/>
                 <w:sz w:val="17"/>
               </w:rPr>
-              <w:t>POR ACORDAR POR EL CDP</w:t>
             </w:r>
           </w:p>
         </w:tc>
@@ -8975,7 +9268,6 @@
                 <w:color w:val="203740"/>
                 <w:sz w:val="17"/>
               </w:rPr>
-              <w:t>POR ACORDAR POR EL CDP</w:t>
             </w:r>
           </w:p>
         </w:tc>
@@ -9029,7 +9321,6 @@
                 <w:color w:val="203740"/>
                 <w:sz w:val="17"/>
               </w:rPr>
-              <w:t>POR ACORDAR POR EL CDP</w:t>
             </w:r>
           </w:p>
         </w:tc>
@@ -9083,7 +9374,6 @@
                 <w:color w:val="203740"/>
                 <w:sz w:val="17"/>
               </w:rPr>
-              <w:t>POR ACORDAR POR EL CDP</w:t>
             </w:r>
           </w:p>
         </w:tc>
@@ -9137,7 +9427,6 @@
                 <w:color w:val="203740"/>
                 <w:sz w:val="17"/>
               </w:rPr>
-              <w:t>POR ACORDAR POR EL CDP</w:t>
             </w:r>
           </w:p>
         </w:tc>
@@ -9191,7 +9480,6 @@
                 <w:color w:val="203740"/>
                 <w:sz w:val="17"/>
               </w:rPr>
-              <w:t>POR ACORDAR POR EL CDP</w:t>
             </w:r>
           </w:p>
         </w:tc>
@@ -9245,7 +9533,6 @@
                 <w:color w:val="203740"/>
                 <w:sz w:val="17"/>
               </w:rPr>
-              <w:t>POR ACORDAR POR EL CDP</w:t>
             </w:r>
           </w:p>
         </w:tc>
@@ -9299,7 +9586,6 @@
                 <w:color w:val="203740"/>
                 <w:sz w:val="17"/>
               </w:rPr>
-              <w:t>POR ACORDAR POR EL CDP</w:t>
             </w:r>
           </w:p>
         </w:tc>
@@ -9353,7 +9639,6 @@
                 <w:color w:val="203740"/>
                 <w:sz w:val="17"/>
               </w:rPr>
-              <w:t>POR ACORDAR POR EL CDP</w:t>
             </w:r>
           </w:p>
         </w:tc>
@@ -10118,7 +10403,7 @@
           <w:color w:val="203740"/>
           <w:sz w:val="21"/>
         </w:rPr>
-        <w:t>El consolidado 003 registra diez demandas de María Trinidad Sánchez priorizadas en 2026. Se incluyen como evidencia de participación y como insumo para contrastar con el diagnóstico. El CDP deberá revisar vigencia, alcance, duplicidades, institución responsable, código SNIP, madurez técnica y financiamiento.</w:t>
+        <w:t>El consolidado 003 registra 10 demandas de María Trinidad Sánchez priorizadas en 2026. Se incluyen como evidencia de participación y como insumo para contrastar con el diagnóstico. El CDP deberá revisar vigencia, alcance, duplicidades, institución responsable, código SNIP, madurez técnica y financiamiento.</w:t>
       </w:r>
     </w:p>
     <w:tbl>
@@ -12490,7 +12775,7 @@
                 <w:color w:val="203740"/>
                 <w:sz w:val="15"/>
               </w:rPr>
-              <w:t>Diez demandas de María Trinidad Sánchez</w:t>
+              <w:t>10 demandas de María Trinidad Sánchez</w:t>
             </w:r>
           </w:p>
         </w:tc>
@@ -12996,7 +13281,7 @@
                 <w:color w:val="203740"/>
                 <w:sz w:val="19"/>
               </w:rPr>
-              <w:t>Documento base elaborado con información disponible al 1 de agosto de 2026. Antes de una sesión formal, la comisión técnica deberá revisar cambios de fuente, períodos parciales y actualizaciones institucionales.</w:t>
+              <w:t>Documento base elaborado con información disponible al 2 de agosto de 2026. Antes de una sesión formal, la comisión técnica deberá revisar cambios de fuente, períodos parciales y actualizaciones institucionales.</w:t>
             </w:r>
           </w:p>
         </w:tc>

</xml_diff>